<commit_message>
Add formatted PDF and cover-enhanced report exports
</commit_message>
<xml_diff>
--- a/reports/informe_miniproyecto_2.docx
+++ b/reports/informe_miniproyecto_2.docx
@@ -2,6 +2,130 @@
 <file path=word/document.xml><?xml version="1.0" encoding="utf-8"?>
 <w:document xmlns:wpc="http://schemas.microsoft.com/office/word/2010/wordprocessingCanvas" xmlns:mo="http://schemas.microsoft.com/office/mac/office/2008/main" xmlns:mc="http://schemas.openxmlformats.org/markup-compatibility/2006" xmlns:mv="urn:schemas-microsoft-com:mac:vml" xmlns:o="urn:schemas-microsoft-com:office:office" xmlns:r="http://schemas.openxmlformats.org/officeDocument/2006/relationships" xmlns:m="http://schemas.openxmlformats.org/officeDocument/2006/math" xmlns:v="urn:schemas-microsoft-com:vml" xmlns:wp14="http://schemas.microsoft.com/office/word/2010/wordprocessingDrawing" xmlns:wp="http://schemas.openxmlformats.org/drawingml/2006/wordprocessingDrawing" xmlns:w10="urn:schemas-microsoft-com:office:word" xmlns:w="http://schemas.openxmlformats.org/wordprocessingml/2006/main" xmlns:w14="http://schemas.microsoft.com/office/word/2010/wordml" xmlns:wpg="http://schemas.microsoft.com/office/word/2010/wordprocessingGroup" xmlns:wpi="http://schemas.microsoft.com/office/word/2010/wordprocessingInk" xmlns:wne="http://schemas.microsoft.com/office/word/2006/wordml" xmlns:wps="http://schemas.microsoft.com/office/word/2010/wordprocessingShape" mc:Ignorable="w14 wp14">
   <w:body>
+    <w:p>
+      <w:pPr>
+        <w:jc w:val="center"/>
+      </w:pPr>
+      <w:r>
+        <w:rPr>
+          <w:b/>
+          <w:sz w:val="32"/>
+        </w:rPr>
+        <w:t>Universidad Autonoma de Occidente</w:t>
+      </w:r>
+    </w:p>
+    <w:p>
+      <w:pPr>
+        <w:jc w:val="center"/>
+      </w:pPr>
+      <w:r>
+        <w:rPr>
+          <w:b/>
+          <w:sz w:val="28"/>
+        </w:rPr>
+        <w:t>Fundamentos y Aplicaciones de Inteligencia Artificial</w:t>
+      </w:r>
+    </w:p>
+    <w:p/>
+    <w:p>
+      <w:pPr>
+        <w:jc w:val="center"/>
+      </w:pPr>
+      <w:r>
+        <w:rPr>
+          <w:b/>
+          <w:sz w:val="36"/>
+        </w:rPr>
+        <w:t>MiniProyecto 2 - Clasificacion de niveles de obesidad</w:t>
+      </w:r>
+    </w:p>
+    <w:p>
+      <w:pPr>
+        <w:jc w:val="center"/>
+      </w:pPr>
+      <w:r>
+        <w:rPr>
+          <w:i/>
+          <w:sz w:val="26"/>
+        </w:rPr>
+        <w:t>Informe final</w:t>
+      </w:r>
+    </w:p>
+    <w:p/>
+    <w:p/>
+    <w:p>
+      <w:pPr>
+        <w:jc w:val="center"/>
+      </w:pPr>
+      <w:r>
+        <w:rPr>
+          <w:sz w:val="24"/>
+        </w:rPr>
+        <w:t>Profesor: Juan Sebastian Mosquera Maturana</w:t>
+      </w:r>
+    </w:p>
+    <w:p>
+      <w:pPr>
+        <w:jc w:val="center"/>
+      </w:pPr>
+      <w:r>
+        <w:rPr>
+          <w:sz w:val="24"/>
+        </w:rPr>
+        <w:t>Fecha: 17/04/2026</w:t>
+      </w:r>
+    </w:p>
+    <w:p/>
+    <w:p>
+      <w:pPr>
+        <w:jc w:val="center"/>
+      </w:pPr>
+      <w:r>
+        <w:rPr>
+          <w:b/>
+          <w:sz w:val="24"/>
+        </w:rPr>
+        <w:t>Integrantes</w:t>
+      </w:r>
+    </w:p>
+    <w:p>
+      <w:pPr>
+        <w:jc w:val="center"/>
+      </w:pPr>
+      <w:r>
+        <w:rPr>
+          <w:sz w:val="24"/>
+        </w:rPr>
+        <w:t>Valentina Popo Montilla</w:t>
+      </w:r>
+    </w:p>
+    <w:p>
+      <w:pPr>
+        <w:jc w:val="center"/>
+      </w:pPr>
+      <w:r>
+        <w:rPr>
+          <w:sz w:val="24"/>
+        </w:rPr>
+        <w:t>Juan Camilo Balleresteros Sierra</w:t>
+      </w:r>
+    </w:p>
+    <w:p>
+      <w:pPr>
+        <w:jc w:val="center"/>
+      </w:pPr>
+      <w:r>
+        <w:rPr>
+          <w:sz w:val="24"/>
+        </w:rPr>
+        <w:t>Santigo Rodriguez Gacha</w:t>
+      </w:r>
+    </w:p>
+    <w:p>
+      <w:r>
+        <w:br w:type="page"/>
+      </w:r>
+    </w:p>
     <w:p>
       <w:pPr>
         <w:jc w:val="center"/>

</xml_diff>